<commit_message>
Updated many many things
</commit_message>
<xml_diff>
--- a/docx/Alamenciak_CV.docx
+++ b/docx/Alamenciak_CV.docx
@@ -50,7 +50,7 @@
       <w:pPr>
         <w:spacing w:after="40" w:before="0"/>
       </w:pPr>
-      <w:hyperlink w:history="1" r:id="rIdtc__duua4qvdp7whd1ma3">
+      <w:hyperlink w:history="1" r:id="rIdu2tksohlykqsyy8sl3gnk">
         <w:r>
           <w:rPr>
             <w:rFonts w:ascii="Arial" w:cs="Arial" w:eastAsia="Arial" w:hAnsi="Arial"/>
@@ -70,7 +70,7 @@
         </w:rPr>
         <w:t xml:space="preserve">  |  </w:t>
       </w:r>
-      <w:hyperlink w:history="1" r:id="rIdox5lft5fakhwb2-2agsp0">
+      <w:hyperlink w:history="1" r:id="rId6chsjyatczpmzevdm243h">
         <w:r>
           <w:rPr>
             <w:rFonts w:ascii="Arial" w:cs="Arial" w:eastAsia="Arial" w:hAnsi="Arial"/>
@@ -246,7 +246,7 @@
               </w:rPr>
               <w:t xml:space="preserve">. </w:t>
             </w:r>
-            <w:hyperlink w:history="1" r:id="rIdjrlek_1w0ysthi6b-0flz">
+            <w:hyperlink w:history="1" r:id="rIducd7qytwbafysdn4h4vdg">
               <w:r>
                 <w:rPr>
                   <w:rFonts w:ascii="Arial" w:cs="Arial" w:eastAsia="Arial" w:hAnsi="Arial"/>
@@ -392,7 +392,7 @@
               </w:rPr>
               <w:t xml:space="preserve">. </w:t>
             </w:r>
-            <w:hyperlink w:history="1" r:id="rIdchg88xyxcmmds1ygtlpkf">
+            <w:hyperlink w:history="1" r:id="rIdramjxghminfs7frhvwlgl">
               <w:r>
                 <w:rPr>
                   <w:rFonts w:ascii="Arial" w:cs="Arial" w:eastAsia="Arial" w:hAnsi="Arial"/>
@@ -538,7 +538,7 @@
               </w:rPr>
               <w:t xml:space="preserve">. </w:t>
             </w:r>
-            <w:hyperlink w:history="1" r:id="rIdurgd0jhf5oiqddeawjopc">
+            <w:hyperlink w:history="1" r:id="rIdbmttzy5bh4_19j-5oacfg">
               <w:r>
                 <w:rPr>
                   <w:rFonts w:ascii="Arial" w:cs="Arial" w:eastAsia="Arial" w:hAnsi="Arial"/>
@@ -692,7 +692,7 @@
               </w:rPr>
               <w:t xml:space="preserve">. </w:t>
             </w:r>
-            <w:hyperlink w:history="1" r:id="rIdshvu_bc_wyn_tzpajpnph">
+            <w:hyperlink w:history="1" r:id="rIdxe18whl_px0uilqfdk7nm">
               <w:r>
                 <w:rPr>
                   <w:rFonts w:ascii="Arial" w:cs="Arial" w:eastAsia="Arial" w:hAnsi="Arial"/>
@@ -846,7 +846,7 @@
               </w:rPr>
               <w:t xml:space="preserve">. </w:t>
             </w:r>
-            <w:hyperlink w:history="1" r:id="rId893cmz-5met0uupsxeact">
+            <w:hyperlink w:history="1" r:id="rIdjj0ftt-19ntwdcndi1j3j">
               <w:r>
                 <w:rPr>
                   <w:rFonts w:ascii="Arial" w:cs="Arial" w:eastAsia="Arial" w:hAnsi="Arial"/>
@@ -1000,7 +1000,7 @@
               </w:rPr>
               <w:t xml:space="preserve">. </w:t>
             </w:r>
-            <w:hyperlink w:history="1" r:id="rIdidiwadvuysjqvfnpcepqg">
+            <w:hyperlink w:history="1" r:id="rIdoixh5fv0-7o2qfzysydqy">
               <w:r>
                 <w:rPr>
                   <w:rFonts w:ascii="Arial" w:cs="Arial" w:eastAsia="Arial" w:hAnsi="Arial"/>
@@ -1146,7 +1146,7 @@
               </w:rPr>
               <w:t xml:space="preserve">. </w:t>
             </w:r>
-            <w:hyperlink w:history="1" r:id="rIdye_gsedlqtkjzrn_wz2-p">
+            <w:hyperlink w:history="1" r:id="rIdf5pnzzey0zabbrik3grvj">
               <w:r>
                 <w:rPr>
                   <w:rFonts w:ascii="Arial" w:cs="Arial" w:eastAsia="Arial" w:hAnsi="Arial"/>
@@ -1166,7 +1166,7 @@
               </w:rPr>
               <w:t xml:space="preserve"> | </w:t>
             </w:r>
-            <w:hyperlink w:history="1" r:id="rIdkfrjfvrjmbr_ndiuyz-hs">
+            <w:hyperlink w:history="1" r:id="rIdyd3rpkokqcbqj8kfvkm8z">
               <w:r>
                 <w:rPr>
                   <w:rFonts w:ascii="Arial" w:cs="Arial" w:eastAsia="Arial" w:hAnsi="Arial"/>
@@ -1312,7 +1312,7 @@
               </w:rPr>
               <w:t xml:space="preserve">. </w:t>
             </w:r>
-            <w:hyperlink w:history="1" r:id="rId808xe5hyruwzyqzzu5cai">
+            <w:hyperlink w:history="1" r:id="rId-gzj823cildf88bbb7puq">
               <w:r>
                 <w:rPr>
                   <w:rFonts w:ascii="Arial" w:cs="Arial" w:eastAsia="Arial" w:hAnsi="Arial"/>
@@ -1332,7 +1332,7 @@
               </w:rPr>
               <w:t xml:space="preserve"> | </w:t>
             </w:r>
-            <w:hyperlink w:history="1" r:id="rIdgqnjcid5gn6pz3jgkjqva">
+            <w:hyperlink w:history="1" r:id="rIdo0q309bbtotau1z5qauqg">
               <w:r>
                 <w:rPr>
                   <w:rFonts w:ascii="Arial" w:cs="Arial" w:eastAsia="Arial" w:hAnsi="Arial"/>
@@ -1478,7 +1478,7 @@
               </w:rPr>
               <w:t xml:space="preserve">. </w:t>
             </w:r>
-            <w:hyperlink w:history="1" r:id="rIdmoh3szotvrjjdjandamh4">
+            <w:hyperlink w:history="1" r:id="rIdapdjw-wy1vcug-se9lvup">
               <w:r>
                 <w:rPr>
                   <w:rFonts w:ascii="Arial" w:cs="Arial" w:eastAsia="Arial" w:hAnsi="Arial"/>
@@ -1498,7 +1498,7 @@
               </w:rPr>
               <w:t xml:space="preserve"> | </w:t>
             </w:r>
-            <w:hyperlink w:history="1" r:id="rIda_kvjqzmb4musxnkju7my">
+            <w:hyperlink w:history="1" r:id="rIdqnw9bmrrklxsxsjveqzdv">
               <w:r>
                 <w:rPr>
                   <w:rFonts w:ascii="Arial" w:cs="Arial" w:eastAsia="Arial" w:hAnsi="Arial"/>
@@ -1644,7 +1644,7 @@
               </w:rPr>
               <w:t xml:space="preserve">. </w:t>
             </w:r>
-            <w:hyperlink w:history="1" r:id="rIdeep7htqfmt_didyom4bvg">
+            <w:hyperlink w:history="1" r:id="rIdbdi7sxvx7n1z3vx3i_2nl">
               <w:r>
                 <w:rPr>
                   <w:rFonts w:ascii="Arial" w:cs="Arial" w:eastAsia="Arial" w:hAnsi="Arial"/>
@@ -1664,7 +1664,7 @@
               </w:rPr>
               <w:t xml:space="preserve"> | </w:t>
             </w:r>
-            <w:hyperlink w:history="1" r:id="rIdk9lgkobvtwy4tuz_u6ytk">
+            <w:hyperlink w:history="1" r:id="rIdcfodshck90fdel2kmz_or">
               <w:r>
                 <w:rPr>
                   <w:rFonts w:ascii="Arial" w:cs="Arial" w:eastAsia="Arial" w:hAnsi="Arial"/>
@@ -1818,7 +1818,7 @@
               </w:rPr>
               <w:t xml:space="preserve">. </w:t>
             </w:r>
-            <w:hyperlink w:history="1" r:id="rIdgtbvtuw9adtisglar3flc">
+            <w:hyperlink w:history="1" r:id="rIds-w8kzy1sjbjxwiqdei1j">
               <w:r>
                 <w:rPr>
                   <w:rFonts w:ascii="Arial" w:cs="Arial" w:eastAsia="Arial" w:hAnsi="Arial"/>
@@ -1972,7 +1972,7 @@
               </w:rPr>
               <w:t xml:space="preserve">. </w:t>
             </w:r>
-            <w:hyperlink w:history="1" r:id="rIdf3bghmv_xjnvt099zqpto">
+            <w:hyperlink w:history="1" r:id="rIdthdqewk85ulamhjetvyoy">
               <w:r>
                 <w:rPr>
                   <w:rFonts w:ascii="Arial" w:cs="Arial" w:eastAsia="Arial" w:hAnsi="Arial"/>
@@ -2538,7 +2538,7 @@
               </w:rPr>
               <w:t xml:space="preserve">. </w:t>
             </w:r>
-            <w:hyperlink w:history="1" r:id="rIdxlojiviqlqm36bqlxgu2x">
+            <w:hyperlink w:history="1" r:id="rIdfa4i56qhhri_yjlsckvoq">
               <w:r>
                 <w:rPr>
                   <w:rFonts w:ascii="Arial" w:cs="Arial" w:eastAsia="Arial" w:hAnsi="Arial"/>
@@ -2709,7 +2709,7 @@
               </w:rPr>
               <w:t xml:space="preserve">. </w:t>
             </w:r>
-            <w:hyperlink w:history="1" r:id="rIdbxuyev4ecdsq69nfmvk4m">
+            <w:hyperlink w:history="1" r:id="rId-ln1i6uwlqnkcmyvez9-m">
               <w:r>
                 <w:rPr>
                   <w:rFonts w:ascii="Arial" w:cs="Arial" w:eastAsia="Arial" w:hAnsi="Arial"/>
@@ -2872,7 +2872,7 @@
           <w:sz w:val="20"/>
           <w:szCs w:val="20"/>
         </w:rPr>
-        <w:t xml:space="preserve">"EcoWeaver Workbench  hands-on schema prototyping"</w:t>
+        <w:t xml:space="preserve">"EcoWeaver Workbench — hands-on schema prototyping"</w:t>
       </w:r>
       <w:r>
         <w:rPr>

</xml_diff>